<commit_message>
init. plan for data collection
</commit_message>
<xml_diff>
--- a/Linux_Eye_Tracking_Technical_Plan.docx
+++ b/Linux_Eye_Tracking_Technical_Plan.docx
@@ -7,6 +7,9 @@
         <w:pStyle w:val="Title"/>
       </w:pPr>
       <w:r>
+        <w:rPr>
+          <w:color w:val="000000"/>
+        </w:rPr>
         <w:t>Linux Eye Tracking Technical Plan</w:t>
       </w:r>
     </w:p>
@@ -15,22 +18,25 @@
         <w:pStyle w:val="Subtitle"/>
       </w:pPr>
       <w:r>
+        <w:rPr>
+          <w:color w:val="000000"/>
+        </w:rPr>
         <w:t>Module decisions and implementation timeline</w:t>
       </w:r>
     </w:p>
     <w:p>
       <w:r>
-        <w:t>Prepared for Yihao Sun  |  19 October 2026  |  Version 1.1</w:t>
+        <w:t>Prepared for Yihao Sun  |  25 October 2026  |  Version 1.2</w:t>
       </w:r>
     </w:p>
     <w:p>
       <w:r>
-        <w:t>We will build an offline Ubuntu 24.04 application for the Lenovo XiaoXinPro 14 IMH9 with a Core Ultra 5 125H. It will estimate gaze, move the pointer, and use a deliberate longer blink for a left click. Development will target the user's usual glasses and an approximately 70 cm viewing distance. This is feasible as a prototype; the first release must establish a reliable target size on this laptop.</w:t>
+        <w:t>We will build an offline eye-tracking application for the Lenovo XiaoXinPro 14 IMH9 on Ubuntu. The accepted design uses four-corner calibration, personal gaze estimation and left, right and middle button toggles. Triple short blink (SSS) is reserved for middle press/release; detailed remaining bindings will be assigned after trials.</w:t>
       </w:r>
     </w:p>
     <w:p>
       <w:r>
-        <w:t>Use Python, OpenCV, a local MediaPipe Face Landmarker, personal regression, and a separate Linux input backend. The four week core estimate remains, with early tests for camera detail through glasses and desktop compatibility. Reserve additional time for Wayland integration if the day 1 probe exposes a gap.</w:t>
+        <w:t>Prototype capture and environment checks support continuing at about 15 FPS; the original 20-update/s release goal remains unmet. Collection and personal fitting have not started. This revision separates gaze training, personalized gesture recognition and explicit button state handling. Current Markdown specifications in docs provide the detailed acquisition and evaluation protocols.</w:t>
       </w:r>
     </w:p>
     <w:p>
@@ -38,12 +44,15 @@
         <w:pStyle w:val="Heading1"/>
       </w:pPr>
       <w:r>
+        <w:rPr>
+          <w:color w:val="000000"/>
+        </w:rPr>
         <w:t>Scope and assumptions</w:t>
       </w:r>
     </w:p>
     <w:p>
       <w:r>
-        <w:t>The core release supports one seated user, one webcam, and one selected laptop display. It includes diagnostics, nine point calibration, independent validation, absolute pointer movement, deliberate blink clicking, optional dwell clicking, pause and resume, local profiles, and an offline installation path.</w:t>
+        <w:t>Support one seated user, one webcam and one laptop display. Include four-corner session calibration, an independent center check, gaze tracking, held-button toggles, pause, local profiles and offline operation. A repeated trigger releases its held button. Keep complete-click convenience commands optional and detailed bindings configurable.</w:t>
       </w:r>
     </w:p>
     <w:p>
@@ -51,7 +60,7 @@
         <w:keepNext/>
       </w:pPr>
       <w:r>
-        <w:t>The user wears glasses, sits approximately 70 cm from the display, can adjust room lighting, and expects little body movement. Keep these conditions during calibration and ordinary use. Keyboard or touchpad assistance is assumed for setup and recovery. Fully hands free recovery, multiple displays, scrolling, dragging, and right click remain later extensions.</w:t>
+        <w:t>Use the same glasses and collect across daylight, room light and desk-lamp light, approximately 65 to 75 cm and small posture/placement changes. Keyboard or touchpad remains available for setup and stop. Middle-button press/release is in scope; wheel rotation, multiple displays, wink gestures and fully hands-free recovery remain separate extensions.</w:t>
       </w:r>
     </w:p>
     <w:tbl>
@@ -163,7 +172,7 @@
                 <w:b w:val="0"/>
                 <w:sz w:val="20"/>
               </w:rPr>
-              <w:t>Use Python 3.12; verify desktop session, installed kernel, and portal behavior.</w:t>
+              <w:t>Continue the observed Python 3.13.5 environment; preserve its package snapshot and tested Linux setup.</w:t>
             </w:r>
           </w:p>
         </w:tc>
@@ -305,7 +314,7 @@
     </w:p>
     <w:p>
       <w:r>
-        <w:t>Decision notation. Numbered module decisions are the proposed baseline. Items labeled Conditional depend on laptop tests; Deferred items are outside the core schedule. All numeric thresholds are initial engineering settings or acceptance targets, not measured results.</w:t>
+        <w:t>Decision notation. This revision supersedes older nine-point-first and single-blink-click defaults. SSS is the intended middle toggle; remaining mappings, numeric thresholds and quality gates are selected from pilot/development evidence. Historical validation records retain their original observations. No runtime changes or new measured accuracy are implied.</w:t>
       </w:r>
     </w:p>
     <w:p>
@@ -318,6 +327,9 @@
         <w:pStyle w:val="Heading1"/>
       </w:pPr>
       <w:r>
+        <w:rPr>
+          <w:color w:val="000000"/>
+        </w:rPr>
         <w:t>Module 01 Runtime architecture</w:t>
       </w:r>
     </w:p>
@@ -337,41 +349,8 @@
         <w:t xml:space="preserve">A01  Language and dependencies. </w:t>
       </w:r>
       <w:r>
-        <w:t xml:space="preserve">Target Ubuntu 24.04 on x86_64 with its Python 3.12 in a virtual environment, plus OpenCV, MediaPipe Tasks, NumPy, scikit learn, and PySide6. Lock compatible versions and hashes after a day 1 import test. If a required wheel fails, use a separately installed supported interpreter; do not replace Ubuntu's system Python. </w:t>
+        <w:t>Continue with the tested Linux environment, whose reports show Python 3.13.5, OpenCV, MediaPipe Tasks, NumPy, scikit-learn and PySide6. Preserve the recorded package snapshot and establish a tested lock/offline bundle later. Do not replace the system interpreter or assume the original Python 3.12 proposal is the measured runtime.</w:t>
       </w:r>
-      <w:hyperlink r:id="rId10">
-        <w:r>
-          <w:rPr>
-            <w:color w:val="175B85"/>
-            <w:u w:val="single"/>
-          </w:rPr>
-          <w:t>[S3]</w:t>
-        </w:r>
-      </w:hyperlink>
-      <w:r>
-        <w:t xml:space="preserve"> </w:t>
-      </w:r>
-      <w:hyperlink r:id="rId11">
-        <w:r>
-          <w:rPr>
-            <w:color w:val="175B85"/>
-            <w:u w:val="single"/>
-          </w:rPr>
-          <w:t>[S11]</w:t>
-        </w:r>
-      </w:hyperlink>
-      <w:r>
-        <w:t xml:space="preserve"> </w:t>
-      </w:r>
-      <w:hyperlink r:id="rId26">
-        <w:r>
-          <w:rPr>
-            <w:color w:val="175B85"/>
-            <w:u w:val="single"/>
-          </w:rPr>
-          <w:t>[S18]</w:t>
-        </w:r>
-      </w:hyperlink>
     </w:p>
     <w:p>
       <w:pPr>
@@ -449,6 +428,9 @@
         <w:keepNext/>
       </w:pPr>
       <w:r>
+        <w:rPr>
+          <w:color w:val="000000"/>
+        </w:rPr>
         <w:t>Data contracts</w:t>
       </w:r>
     </w:p>
@@ -690,7 +672,7 @@
                 <w:b w:val="0"/>
                 <w:sz w:val="20"/>
               </w:rPr>
-              <w:t>Event ID, event type, start and end times, frozen target, cancellation reason.</w:t>
+              <w:t>Sequence ID, confirmed pattern, timing, quality, frozen target, decoder/profile version and rejection reason.</w:t>
             </w:r>
           </w:p>
         </w:tc>
@@ -733,7 +715,7 @@
                 <w:b w:val="0"/>
                 <w:sz w:val="20"/>
               </w:rPr>
-              <w:t>Command ID, target display, logical coordinates or button event, timestamp.</w:t>
+              <w:t>Command ID, binding version, button/down/up, coordinates, held state before/after and dispatch result.</w:t>
             </w:r>
           </w:p>
         </w:tc>
@@ -762,6 +744,9 @@
         <w:pStyle w:val="Heading1"/>
       </w:pPr>
       <w:r>
+        <w:rPr>
+          <w:color w:val="000000"/>
+        </w:rPr>
         <w:t>Module 02 Camera acquisition</w:t>
       </w:r>
     </w:p>
@@ -790,7 +775,7 @@
         <w:t xml:space="preserve">C02  Resolution and frame rate. </w:t>
       </w:r>
       <w:r>
-        <w:t>Compare native 1280 by 720 and 1920 by 1080, aiming for 30 frames per second where supported; retain 640 by 480 as a diagnostic fallback. At 70 cm, choose using eye detail, fresh validation error, valid update rate, and latency. Enumerate format and frame interval combinations: 1080p at 30 fps is a test candidate, not a verified property of this unit.</w:t>
+        <w:t>Propose native 1920 by 1080 MJPG for the collection pilot. Both seated short modes delivered about 14.8 FPS; 1080p produced larger predicted eye spans. Only 720p has the completed ten-minute baseline. Measure the new UI/storage workload; do not promise improved gaze accuracy from resolution alone.</w:t>
       </w:r>
     </w:p>
     <w:p>
@@ -864,6 +849,9 @@
         <w:pStyle w:val="Heading2"/>
       </w:pPr>
       <w:r>
+        <w:rPr>
+          <w:color w:val="000000"/>
+        </w:rPr>
         <w:t>Camera specification and local verification</w:t>
       </w:r>
     </w:p>
@@ -929,7 +917,7 @@
     </w:p>
     <w:p>
       <w:r>
-        <w:t>Module acceptance. Compare available 720p and 1080p modes with glasses at 70 cm, then run the selected mode for ten minutes. Report valid updates, dropout, eye crop dimensions, CPU cost, and latency. Verify disconnect, permission, and contention recovery without emitting input.</w:t>
+        <w:t>Module evidence. Seated 720p/1080p runs and the ten-minute 720p baseline are complete; preserve their reports. Review actual 1080p mode, throughput and data quality under the new collector workload in three pilots. Do not repeat all environment checks or claim sustained 1080p performance from the short run.</w:t>
       </w:r>
     </w:p>
     <w:p>
@@ -937,6 +925,9 @@
         <w:pStyle w:val="Heading1"/>
       </w:pPr>
       <w:r>
+        <w:rPr>
+          <w:color w:val="000000"/>
+        </w:rPr>
         <w:t>Module 03 Eye landmarks and feature extraction</w:t>
       </w:r>
     </w:p>
@@ -1056,6 +1047,9 @@
         <w:pStyle w:val="Heading1"/>
       </w:pPr>
       <w:r>
+        <w:rPr>
+          <w:color w:val="000000"/>
+        </w:rPr>
         <w:t>Module 04 Calibration and drift management</w:t>
       </w:r>
     </w:p>
@@ -1070,7 +1064,7 @@
         <w:t xml:space="preserve">K01  Target layout. </w:t>
       </w:r>
       <w:r>
-        <w:t>Use nine targets at 10, 50, and 90 percent of display width and height. Begin at the center and visit the remaining points in a fixed documented order. Four corners remain an experiment; the nine point baseline better samples the screen interior.</w:t>
+        <w:t>At each new setup, look clockwise at top-left, top-right, bottom-right and bottom-left targets, inset 5 percent. Save actual rendered coordinates. Fit the session transform from these anchors only, then present an independent center check. Nine-point calibration is a later comparison if interior accuracy is inadequate.</w:t>
       </w:r>
     </w:p>
     <w:p>
@@ -1084,7 +1078,7 @@
         <w:t xml:space="preserve">K02  Sampling. </w:t>
       </w:r>
       <w:r>
-        <w:t>At each point allow 400 ms to settle, then collect at least one second and at least 15 valid observations. Extend collection up to three seconds when necessary and retry failed targets. Exclude blink windows, unstable pose, and poor eye geometry. Target 20 to 30 seconds for a clean calibration, with validation taking additional time.</w:t>
+        <w:t>At each corner allow two seconds preparation, then two seconds measurement, aiming for 20 eligible fresh observations. Extend measurement to four seconds if needed, then retry. Ordinary gaze targets use two seconds preparation and 1.5 seconds measurement. Exclude transition/closed-eye frames from gaze fitting while retaining them in gesture traces.</w:t>
       </w:r>
     </w:p>
     <w:p>
@@ -1098,7 +1092,7 @@
         <w:t xml:space="preserve">K03  Quality control. </w:t>
       </w:r>
       <w:r>
-        <w:t>Cap each target's contribution and use robust summaries to flag outliers. Repeat poorly sampled targets. At the normal 70 cm position and chosen lighting, collect an open eye baseline and three deliberate blink examples with glasses on. If reflection or blur prevents reliable eye geometry, fix capture before fitting.</w:t>
+        <w:t>Use robust, equally weighted anchor summaries and reject degenerate mappings. Keep calibration anchors, center checks, gaze targets, gesture reference samples and negative reading distinct. Repeat insufficient anchors; set numerical conditioning and check gates using pilot/development data before final evaluation. Prompt timing alone is not verified action ground truth.</w:t>
       </w:r>
     </w:p>
     <w:p>
@@ -1112,7 +1106,7 @@
         <w:t xml:space="preserve">K04  Independent validation. </w:t>
       </w:r>
       <w:r>
-        <w:t>Use fresh target presentations at the center, intermediate positions, and near the usable edges. Show targets in a different order, with the predicted dot hidden while collecting accuracy data. Reserve this set for reporting; it must not choose model hyperparameters.</w:t>
+        <w:t>Use new sessions and fresh target presentations with the predicted dot hidden. Test-session adaptation uses only designated calibration samples under the frozen procedure. Center readiness checks and scored fixations must not train the transform or shared model. Use development sessions for selection and reserve final sessions for reporting.</w:t>
       </w:r>
     </w:p>
     <w:p>
@@ -1140,7 +1134,7 @@
         <w:t xml:space="preserve">K06  Profile compatibility. </w:t>
       </w:r>
       <w:r>
-        <w:t>Bind a profile to camera identity and mode, display and scaling, model hash, feature schema, and estimator version. Record the usual glasses, nominal 70 cm distance, lighting setup, and face scale. Hardware or schema mismatch blocks activation; changes in glasses, seating, or lighting require a fresh validation check.</w:t>
+        <w:t>Bind profiles to camera/mode, display/scaling, model hash, feature schema and estimator/gesture versions. Store session IDs and conditions. A hardware/schema mismatch blocks activation. Setup changes start a new four-corner calibration segment; all segments from one sitting remain in the same dataset split.</w:t>
       </w:r>
     </w:p>
     <w:p>
@@ -1155,7 +1149,7 @@
         <w:t xml:space="preserve">K07  Drift correction. </w:t>
       </w:r>
       <w:r>
-        <w:t>Offer an explicit center check after moving the laptop, adjusting glasses, changing lighting, or shifting position. Apply a translation only when extra check points show uniform error; otherwise recalibrate. A 65 and 75 cm test will define distance tolerance. Do not adapt from gaze generated clicks or promise automatic distance compensation.</w:t>
+        <w:t>Recalibrate after deliberate changes to distance, laptop placement, lighting or glasses fit. Record a center check separately. Four anchors handle basic session mapping, not arbitrary head compensation. Do not adapt from gaze-generated clicks or scored evaluation samples. Report failures and supported pose ranges.</w:t>
       </w:r>
     </w:p>
     <w:p>
@@ -1168,6 +1162,9 @@
         <w:pStyle w:val="Heading1"/>
       </w:pPr>
       <w:r>
+        <w:rPr>
+          <w:color w:val="000000"/>
+        </w:rPr>
         <w:t>Module 05 Gaze estimation</w:t>
       </w:r>
     </w:p>
@@ -1182,17 +1179,8 @@
         <w:t xml:space="preserve">E01  Baseline model. </w:t>
       </w:r>
       <w:r>
-        <w:t xml:space="preserve">Fit a standardizer followed by Ridge regression with two outputs, normalized display x and y. Start with the four iris features and an intercept. This model is small enough to personalize with a short calibration and inexpensive to evaluate on the CPU. </w:t>
+        <w:t>Fit a 2D affine map per eye using four anchor summaries: six coefficients each, twelve per session. Average the two calibrated screen estimates. Compare this session-only baseline with a shared ridge residual correction trained across sessions; eight calibrated-eye/pose inputs and two outputs give eighteen shared coefficients.</w:t>
       </w:r>
-      <w:hyperlink r:id="rId14">
-        <w:r>
-          <w:rPr>
-            <w:color w:val="175B85"/>
-            <w:u w:val="single"/>
-          </w:rPr>
-          <w:t>[S4]</w:t>
-        </w:r>
-      </w:hyperlink>
     </w:p>
     <w:p>
       <w:pPr>
@@ -1205,7 +1193,7 @@
         <w:t xml:space="preserve">E02  Model selection. </w:t>
       </w:r>
       <w:r>
-        <w:t>Compare a small fixed set of regularization strengths using splits grouped by calibration target or complete fixation block. Weight targets equally. Never randomly split adjacent frames across training and validation, since their correlation can hide generalization errors.</w:t>
+        <w:t>Group train, development and test data by sessions/sittings, preferably days. Fit global normalization and correction weights on training data only. Give fixations and regions balanced weight. Do not randomly split adjacent frames. Fit each held-out session transform only from its permitted four anchors.</w:t>
       </w:r>
     </w:p>
     <w:p>
@@ -1219,7 +1207,7 @@
         <w:t xml:space="preserve">E03  Complexity control. </w:t>
       </w:r>
       <w:r>
-        <w:t>Keep head pose out of the initial regression because a nearly fixed head supplies too little independent pose variation to learn compensation. Add nonlinear terms only with more distinct calibration positions and fresh validation. More features are not automatically more accurate.</w:t>
+        <w:t>Compare correction with and without pose inputs. A degree-two eight-input correction has 90 coefficients; an optional 8 to 32 to 16 to 2 ReLU network has 850 parameters. These are candidates, not required improvements. Select on development sessions and inspect failure causes before adding complexity.</w:t>
       </w:r>
     </w:p>
     <w:p>
@@ -1261,6 +1249,9 @@
         <w:pStyle w:val="Heading1"/>
       </w:pPr>
       <w:r>
+        <w:rPr>
+          <w:color w:val="000000"/>
+        </w:rPr>
         <w:t>Module 06 Pointer filtering and motion</w:t>
       </w:r>
     </w:p>
@@ -1341,7 +1332,7 @@
         <w:t xml:space="preserve">F05  Target history. </w:t>
       </w:r>
       <w:r>
-        <w:t>Maintain approximately 200 ms of valid filtered pointer positions. At blink onset, latch the last stable target and hold it through the gesture. Derive the stability radius from validation jitter and cap it at one quarter of the declared target width. Without stable history, the gesture cannot produce a click.</w:t>
+        <w:t>Latch the last stable pre-closure pointer position through the whole gesture and completion wait, including inter-blink gaps. After a down event and fresh stable gaze, resume motion while held. For an up event latch the current endpoint, not the drag origin. Never dispatch from an unstable target history.</w:t>
       </w:r>
     </w:p>
     <w:p>
@@ -1354,7 +1345,10 @@
         <w:pStyle w:val="Heading1"/>
       </w:pPr>
       <w:r>
-        <w:t>Module 07 Blink and dwell gestures</w:t>
+        <w:rPr>
+          <w:color w:val="000000"/>
+        </w:rPr>
+        <w:t>Module 07 Gesture recognition and button states</w:t>
       </w:r>
     </w:p>
     <w:p>
@@ -1365,10 +1359,10 @@
         <w:rPr>
           <w:b/>
         </w:rPr>
-        <w:t xml:space="preserve">G01  Primary gesture. </w:t>
+        <w:t xml:space="preserve">G01  Vocabulary. </w:t>
       </w:r>
       <w:r>
-        <w:t>Use bilateral closure duration with personalized closed and reopened thresholds. Begin with 500 to 900 ms and adjust from examples collected with glasses on. A comfortable longer closure is the intended action; squeezing harder is unnecessary. Reject the gesture mode if natural blinks and deliberate closures cannot be distinguished reliably.</w:t>
+        <w:t>Collect S, SS, SSS, L and SL, with S near 0.5 seconds and L near 1.5 seconds as cues only. LL is optional exploration. SSS is reserved for middle toggle; other assignments remain open. Reusing a sequence for down/up depends on button state, not two recognition classes.</w:t>
       </w:r>
     </w:p>
     <w:p>
@@ -1379,10 +1373,10 @@
         <w:rPr>
           <w:b/>
         </w:rPr>
-        <w:t xml:space="preserve">G02  State machine. </w:t>
+        <w:t xml:space="preserve">G02  Personalized recognition. </w:t>
       </w:r>
       <w:r>
-        <w:t>Use explicit OPEN, CLOSING, ELIGIBLE, REOPENING, COOLDOWN, and CANCELLED states. Durations use timestamps rather than frame counts. Preserve face and eyelid validity during closure; the absence of a visible iris is expected and is not itself a camera tracking failure.</w:t>
+        <w:t>Fit per-eye open/closed references, hysteresis, duration bands, inter-blink timing and cooldown from confirmed training/development data and negative reading. Use timestamped events and an explicit sequence decoder. Store versioned parameters; do not hardcode universal blink durations. A separate classifier is conditional on measured shortcomings.</w:t>
       </w:r>
     </w:p>
     <w:p>
@@ -1393,10 +1387,10 @@
         <w:rPr>
           <w:b/>
         </w:rPr>
-        <w:t xml:space="preserve">G03  Click timing. </w:t>
+        <w:t xml:space="preserve">G03  Sequence timing. </w:t>
       </w:r>
       <w:r>
-        <w:t>Freeze the pre blink target on closure onset. Emit exactly one click only after reopening has been stable for about 100 ms and the closure duration is inside the allowed interval. Require approximately 150 ms of stable valid gaze before a new gesture can begin.</w:t>
+        <w:t>S and SS must wait while an SSS continuation remains possible. Wait for sequence completion after the third blink too; a fourth closure within that window rejects the pending sequence before dispatch. Freeze the pointer throughout. Emit one event per completed sequence and start cooldown only afterward.</w:t>
       </w:r>
     </w:p>
     <w:p>
@@ -1410,7 +1404,7 @@
         <w:t xml:space="preserve">G04  Cancellation and rearming. </w:t>
       </w:r>
       <w:r>
-        <w:t>Cancel if closure exceeds the configured upper limit, eyelids become unreliable, glare corrupts observations, or a frame gap exceeds 150 ms. A valid observed closure lasting 1.5 seconds disarms control. After a click, require 600 ms cooldown and a fresh open stable interval. Initial timings are configurable; unreadable eyes cannot be treated as a deliberate long closure.</w:t>
+        <w:t>Reject ambiguous, unsupported, overlong or poorly observed sequences; require fresh stable-open data before rearming. The old 1.5-second disarm proposal is not a frozen threshold or simultaneous normal L action. Keep independent Ctrl+Alt+Space pause. Gesture acquisition never dispatches button or stop commands.</w:t>
       </w:r>
     </w:p>
     <w:p>
@@ -1421,10 +1415,10 @@
         <w:rPr>
           <w:b/>
         </w:rPr>
-        <w:t xml:space="preserve">G05  Dwell alternative. </w:t>
+        <w:t xml:space="preserve">G05  Optional alternatives. </w:t>
       </w:r>
       <w:r>
-        <w:t>Offer dwell as a separately selected click mode, initially 800 ms within a fixation radius calibrated from measured jitter. Show progress and reset on movement, closure, or invalidity. Require leaving the region before another dwell click; do not run blink and dwell click modes together.</w:t>
+        <w:t>Consider a complete-click command or a separately selected dwell profile if useful; neither replaces held-button capability. Reserve detailed bindings until sequence confusion and latency are measured. Middle-button behavior depends on the application; press/release alone does not universally establish autoscroll or exit an application-owned mode.</w:t>
       </w:r>
     </w:p>
     <w:p>
@@ -1439,7 +1433,7 @@
         <w:t xml:space="preserve">G06  Button lifecycle. </w:t>
       </w:r>
       <w:r>
-        <w:t>Represent a click as a complete press and release pair, emitted only by the controller. Track gesture IDs to prevent duplicate dispatch. Cancel unfinished commands on backend disconnect, and release any held button on controlled shutdown. Drag lock and wink gestures are Deferred.</w:t>
+        <w:t>Track READY, LEFT_HELD, RIGHT_HELD and MIDDLE_HELD separately from blink decoding. Initially allow one held button. The same trigger releases it; reject other-button requests without queuing. Deduplicate events. On pause/failure attempt releases, record failures and disarm; never assume a revoked channel delivered release.</w:t>
       </w:r>
     </w:p>
     <w:tbl>
@@ -1532,7 +1526,7 @@
                 <w:b w:val="0"/>
                 <w:sz w:val="20"/>
               </w:rPr>
-              <w:t>Short closure below click duration</w:t>
+              <w:t>Ordinary or unbound closure</w:t>
             </w:r>
           </w:p>
         </w:tc>
@@ -1551,7 +1545,7 @@
                 <w:b w:val="0"/>
                 <w:sz w:val="20"/>
               </w:rPr>
-              <w:t>Freeze while closed; resume without a click.</w:t>
+              <w:t>Freeze as needed; resume without a command.</w:t>
             </w:r>
           </w:p>
         </w:tc>
@@ -1575,7 +1569,7 @@
                 <w:b w:val="0"/>
                 <w:sz w:val="20"/>
               </w:rPr>
-              <w:t>Valid deliberate closure then stable reopen</w:t>
+              <w:t>Complete SSS and stable reopening</w:t>
             </w:r>
           </w:p>
         </w:tc>
@@ -1594,7 +1588,7 @@
                 <w:b w:val="0"/>
                 <w:sz w:val="20"/>
               </w:rPr>
-              <w:t>Click the frozen target once, then enter cooldown.</w:t>
+              <w:t>After completion wait, toggle middle once; show held state.</w:t>
             </w:r>
           </w:p>
         </w:tc>
@@ -1618,7 +1612,7 @@
                 <w:b w:val="0"/>
                 <w:sz w:val="20"/>
               </w:rPr>
-              <w:t>Closure exceeds allowed click interval</w:t>
+              <w:t>S or SS prefix; fourth closure</w:t>
             </w:r>
           </w:p>
         </w:tc>
@@ -1637,7 +1631,7 @@
                 <w:b w:val="0"/>
                 <w:sz w:val="20"/>
               </w:rPr>
-              <w:t>Cancel that gesture; do not click on eventual reopening.</w:t>
+              <w:t>Wait for continuation; reject overflow without prefix dispatch.</w:t>
             </w:r>
           </w:p>
         </w:tc>
@@ -1680,7 +1674,7 @@
                 <w:b w:val="0"/>
                 <w:sz w:val="20"/>
               </w:rPr>
-              <w:t>Cancel; require a fresh open stable interval.</w:t>
+              <w:t>Cancel the sequence and disarm as required; attempt held-button release.</w:t>
             </w:r>
           </w:p>
         </w:tc>
@@ -1704,7 +1698,7 @@
                 <w:b w:val="0"/>
                 <w:sz w:val="20"/>
               </w:rPr>
-              <w:t>Pause, stop, or stale inference</w:t>
+              <w:t>Pause or backend failure</w:t>
             </w:r>
           </w:p>
         </w:tc>
@@ -1723,7 +1717,7 @@
                 <w:b w:val="0"/>
                 <w:sz w:val="20"/>
               </w:rPr>
-              <w:t>Disarm immediately and clear pending selection.</w:t>
+              <w:t>Clear pending commands, stop movement, record release outcomes and require explicit recovery.</w:t>
             </w:r>
           </w:p>
         </w:tc>
@@ -1737,7 +1731,7 @@
     </w:p>
     <w:p>
       <w:r>
-        <w:t>Module acceptance. Exercise threshold boundaries, dropped and repeated frames, long closures, reopening noise, natural reading blinks, and cancellation immediately before dispatch. Measure both missed intentional clicks and unintended clicks.</w:t>
+        <w:t>Module acceptance. Evaluate continuous held-out sequences and reading: S/SS/SSS confusion, misses, false commands per minute, abstentions, coverage and latency. Then test all button states, prefixes, duplicates and failures with a mock backend. Recognition accuracy alone does not establish correct desktop button lifecycle.</w:t>
       </w:r>
     </w:p>
     <w:p>
@@ -1745,6 +1739,9 @@
         <w:pStyle w:val="Heading1"/>
       </w:pPr>
       <w:r>
+        <w:rPr>
+          <w:color w:val="000000"/>
+        </w:rPr>
         <w:t>Module 08 Linux input and controller</w:t>
       </w:r>
     </w:p>
@@ -1759,7 +1756,7 @@
         <w:t xml:space="preserve">L01  Backend contract. </w:t>
       </w:r>
       <w:r>
-        <w:t>Define connect, move_absolute, click_left, release_all, disconnect, and capabilities. Include a mock backend that records commands without touching the desktop. The controller requires an armed calibrated session, fresh face and eyelid observations, and backend permission. A frozen pre blink target may age during an otherwise valid deliberate closure.</w:t>
+        <w:t>Define connect, move_absolute, button_down, button_up, release_all, disconnect and capabilities for left, right and middle buttons. Keep all dispatch in one controller and begin with a mock event log. Existing EIS motion evidence does not validate button behavior. Require an armed compatible profile and fresh observations.</w:t>
       </w:r>
     </w:p>
     <w:p>
@@ -1796,53 +1793,8 @@
         <w:t xml:space="preserve">L03  Ubuntu desktop path. </w:t>
       </w:r>
       <w:r>
-        <w:t xml:space="preserve">Plan for GNOME on Wayland if this is standard Ubuntu Desktop, but confirm the active session on day 1. Prefer the XDG RemoteDesktop portal with libei, initially requesting pointer input only. Test absolute motion, permission renewal, and pause. Ubuntu provides portal and libei packages; availability does not prove the complete path works. A small C helper remains Conditional. </w:t>
+        <w:t>Use the tested GNOME Wayland EIS/libei path for later integration; native pointer mapping and diagnostic pause have accepted evidence. Button down/up, held-button release, process failure and target-application behavior need separate validation. Preserve the historical reports rather than rerunning all accepted environment checks.</w:t>
       </w:r>
-      <w:hyperlink r:id="rId17">
-        <w:r>
-          <w:rPr>
-            <w:color w:val="175B85"/>
-            <w:u w:val="single"/>
-          </w:rPr>
-          <w:t>[S6]</w:t>
-        </w:r>
-      </w:hyperlink>
-      <w:r>
-        <w:t xml:space="preserve"> </w:t>
-      </w:r>
-      <w:hyperlink r:id="rId18">
-        <w:r>
-          <w:rPr>
-            <w:color w:val="175B85"/>
-            <w:u w:val="single"/>
-          </w:rPr>
-          <w:t>[S7]</w:t>
-        </w:r>
-      </w:hyperlink>
-      <w:r>
-        <w:t xml:space="preserve"> </w:t>
-      </w:r>
-      <w:hyperlink r:id="rId28">
-        <w:r>
-          <w:rPr>
-            <w:color w:val="175B85"/>
-            <w:u w:val="single"/>
-          </w:rPr>
-          <w:t>[S20]</w:t>
-        </w:r>
-      </w:hyperlink>
-      <w:r>
-        <w:t xml:space="preserve"> </w:t>
-      </w:r>
-      <w:hyperlink r:id="rId29">
-        <w:r>
-          <w:rPr>
-            <w:color w:val="175B85"/>
-            <w:u w:val="single"/>
-          </w:rPr>
-          <w:t>[S21]</w:t>
-        </w:r>
-      </w:hyperlink>
     </w:p>
     <w:p>
       <w:pPr>
@@ -1901,17 +1853,8 @@
         <w:t xml:space="preserve">L06  Pause and recovery. </w:t>
       </w:r>
       <w:r>
-        <w:t xml:space="preserve">For Ubuntu GNOME, plan a user configured desktop keyboard shortcut that invokes the local pause command. Use the GlobalShortcuts portal only after confirming support on this installation; use an X11 binding in an X11 session. Verify pause from another application's focused window before enabling live control. </w:t>
+        <w:t>Retain the tested Ctrl+Alt+Space shortcut and integrate it explicitly with the future controller. Pause cancels pending recognition and stops movement before any delayed prefix can dispatch. Attempt release of held buttons and report undelivered releases. A diagnostic pointer-pause pass is not certification of controller release behavior.</w:t>
       </w:r>
-      <w:hyperlink r:id="rId20">
-        <w:r>
-          <w:rPr>
-            <w:color w:val="175B85"/>
-            <w:u w:val="single"/>
-          </w:rPr>
-          <w:t>[S8]</w:t>
-        </w:r>
-      </w:hyperlink>
     </w:p>
     <w:p>
       <w:pPr>
@@ -1952,6 +1895,9 @@
         <w:pStyle w:val="Heading1"/>
       </w:pPr>
       <w:r>
+        <w:rPr>
+          <w:color w:val="000000"/>
+        </w:rPr>
         <w:t>Module 09 Interface and selection assistance</w:t>
       </w:r>
     </w:p>
@@ -2045,6 +1991,9 @@
         <w:pStyle w:val="Heading1"/>
       </w:pPr>
       <w:r>
+        <w:rPr>
+          <w:color w:val="000000"/>
+        </w:rPr>
         <w:t>Module 10 Local data and privacy</w:t>
       </w:r>
     </w:p>
@@ -2059,7 +2008,7 @@
         <w:t xml:space="preserve">P01  Data minimization. </w:t>
       </w:r>
       <w:r>
-        <w:t>Keep camera frames and temporary eye crops only in memory and discard references promptly. Do not save raw video, screenshots, continuous gaze histories, or face embeddings by default. Memory handling alone does not guarantee that operating system swap or crash dumps contain no traces.</w:t>
+        <w:t>During explicit collection, save local numeric observations and event metadata for gaze, gesture and negative-reading roles. Raw images and temporary crops remain in memory by default. Keep datasets outside the repository. Image retention for annotation or appearance models requires a separate explicit choice; numeric data cannot reconstruct the images.</w:t>
       </w:r>
     </w:p>
     <w:p>
@@ -2073,17 +2022,8 @@
         <w:t xml:space="preserve">P02  Persistent state. </w:t>
       </w:r>
       <w:r>
-        <w:t xml:space="preserve">Use XDG configuration and state directories for settings, model coefficients, feature normalization, thresholds, calibration metadata, and aggregate validation results. Use user private directories and files, and keep profiles out of the source repository. </w:t>
+        <w:t>Use private XDG state directories for versioned numeric datasets, calibration IDs, fitted gaze weights, gesture references/timing, action bindings and evaluation summaries. Keep source and model hashes, session/sitting/day IDs, lighting and actual camera/display metadata. Serialize numeric arrays and JSON without executable loading.</w:t>
       </w:r>
-      <w:hyperlink r:id="rId21">
-        <w:r>
-          <w:rPr>
-            <w:color w:val="175B85"/>
-            <w:u w:val="single"/>
-          </w:rPr>
-          <w:t>[S12]</w:t>
-        </w:r>
-      </w:hyperlink>
     </w:p>
     <w:p>
       <w:pPr>
@@ -2124,7 +2064,7 @@
         <w:t xml:space="preserve">P05  Diagnostics and retention. </w:t>
       </w:r>
       <w:r>
-        <w:t>Log aggregate timings, failures, versions, and calibration quality. Numeric trace capture for debugging is opt in, time limited, and deleted when the user requests it. Camera recording requires a separate explicit action with visible recording status and retention settings.</w:t>
+        <w:t>Existing validation commands remain aggregate-only. The future collector visibly indicates numeric recording and saves complete/incomplete status, prompt versus confirmed labels, timestamps and quality reasons. Separate gesture traces retain closed-eye observations. Keep image recording off unless explicitly enabled and support deletion of collected sessions.</w:t>
       </w:r>
     </w:p>
     <w:p>
@@ -2152,6 +2092,9 @@
         <w:pStyle w:val="Heading1"/>
       </w:pPr>
       <w:r>
+        <w:rPr>
+          <w:color w:val="000000"/>
+        </w:rPr>
         <w:t>Module 11 Evaluation packaging and delivery</w:t>
       </w:r>
     </w:p>
@@ -2177,10 +2120,10 @@
         <w:rPr>
           <w:b/>
         </w:rPr>
-        <w:t xml:space="preserve">Q02  Accuracy protocol. </w:t>
+        <w:t xml:space="preserve">Q02  Dataset protocol. </w:t>
       </w:r>
       <w:r>
-        <w:t>Collect fresh fixations with the usual glasses at approximately 70 cm. Report median and 95th percentile error, stationary dispersion, valid sample fraction, and results by region in logical pixels and screen percentages. Measure physical display size and eye to screen distance before converting to degrees; repeat after a normal repositioning.</w:t>
+        <w:t>Begin with three pilots, then target 15 sessions split 9 training, 3 development and 3 test across all three lighting categories. Each session has 50 gaze fixations, about 17,000 main-window frames overall before exclusions. Four-corner/check samples are additional. Score normalized and logical-pixel error without clipping predictions.</w:t>
       </w:r>
     </w:p>
     <w:p>
@@ -2191,10 +2134,10 @@
         <w:rPr>
           <w:b/>
         </w:rPr>
-        <w:t xml:space="preserve">Q03  Interaction protocol. </w:t>
+        <w:t xml:space="preserve">Q03  Gesture dataset. </w:t>
       </w:r>
       <w:r>
-        <w:t>Test balanced target positions at 32, 64, 128, and 256 logical pixel widths. Record success rate, first click error, time to successful selection, and accidental clicks. Report the smallest passing target size rather than assuming full replacement of a conventional mouse.</w:t>
+        <w:t>Start with five confirmed trials each of S, SS, SSS, L and SL per session: 375 sequences, 75 per class. Add three minutes of ordinary-reading negatives per session, 45 minutes overall. Optional LL stays exploratory. These budgets need pilot review; extend negative testing substantially before deployment.</w:t>
       </w:r>
     </w:p>
     <w:p>
@@ -2205,10 +2148,10 @@
         <w:rPr>
           <w:b/>
         </w:rPr>
-        <w:t xml:space="preserve">Q04  Latency measurement. </w:t>
+        <w:t xml:space="preserve">Q04  Evaluation and timing. </w:t>
       </w:r>
       <w:r>
-        <w:t>Instrument dequeue to inference to dispatch for software latency. Measure capture and display delay separately with an observable stimulus or external video when available. Do not label software timestamps as end to end eye movement latency. Report median and 95th percentile values.</w:t>
+        <w:t>Use independent continuous traces and report per-class confusion, false activations per minute, rejected/invalid coverage and dispatch delay. Separate recognition wait from movement latency. At about 15 FPS use timestamps and uncertain boundaries, not exact frame counts. Do not label read-completion timestamps as exposure or end-to-end latency.</w:t>
       </w:r>
     </w:p>
     <w:p>
@@ -2291,6 +2234,9 @@
         <w:pStyle w:val="Heading2"/>
       </w:pPr>
       <w:r>
+        <w:rPr>
+          <w:color w:val="000000"/>
+        </w:rPr>
         <w:t>Glasses distance and lighting evaluation</w:t>
       </w:r>
     </w:p>
@@ -2299,7 +2245,7 @@
         <w:keepNext/>
       </w:pPr>
       <w:r>
-        <w:t>Choose a lighting setup after short diagnostics, then run the formal baseline evaluation in that setup. Use the other conditions to measure tolerance and failure behavior. Do not count an unsupported stress condition as passing ordinary operation.</w:t>
+        <w:t>Collect daylight, room light at night and desk-lamp light, with the same glasses and small distance/placement variations. Cover the full target area under each condition. Change setup between calibration segments, not silently mid-block. Report failures and invalid coverage; do not exclude difficult conditions merely to improve accuracy.</w:t>
       </w:r>
     </w:p>
     <w:tbl>
@@ -2556,7 +2502,7 @@
                 <w:b w:val="0"/>
                 <w:sz w:val="20"/>
               </w:rPr>
-              <w:t>Compare the selected setup with a dimmer room and stronger side light.</w:t>
+              <w:t>Collect daylight, room lighting and desk-lamp lighting in distinct calibrated blocks.</w:t>
             </w:r>
           </w:p>
         </w:tc>
@@ -2637,7 +2583,7 @@
                 <w:b w:val="0"/>
                 <w:sz w:val="20"/>
               </w:rPr>
-              <w:t>Accept only measured tolerance; otherwise prompt validation or recalibration.</w:t>
+              <w:t>Record tolerance; setup changes require a fresh calibration segment.</w:t>
             </w:r>
           </w:p>
         </w:tc>
@@ -2648,6 +2594,9 @@
         <w:pStyle w:val="Heading1"/>
       </w:pPr>
       <w:r>
+        <w:rPr>
+          <w:color w:val="000000"/>
+        </w:rPr>
         <w:t>Acceptance targets</w:t>
       </w:r>
     </w:p>
@@ -2656,7 +2605,7 @@
         <w:keepNext/>
       </w:pPr>
       <w:r>
-        <w:t>Apply these proposed release criteria to the usual glasses at approximately 70 cm under the selected repeatable lighting. Freeze the criteria before final evaluation. Report challenge conditions separately; failures must change the supported conditions, target size, or assistance plan rather than being hidden by adjusting the test.</w:t>
+        <w:t>The following release goals are proposals, not achieved results. Freeze operational thresholds and supported conditions before final evaluation. Keep gesture recognition, held-button state tests and application behavior separate. Short negative reading with zero false activations cannot establish rare-error reliability over hours.</w:t>
       </w:r>
     </w:p>
     <w:tbl>
@@ -2956,7 +2905,7 @@
                 <w:b w:val="0"/>
                 <w:sz w:val="20"/>
               </w:rPr>
-              <w:t>Deliberate blink detection</w:t>
+              <w:t>Gesture recognition</w:t>
             </w:r>
           </w:p>
         </w:tc>
@@ -2975,7 +2924,7 @@
                 <w:b w:val="0"/>
                 <w:sz w:val="20"/>
               </w:rPr>
-              <w:t>At least 95 percent recognized without duplicates</w:t>
+              <w:t>Set per-class recall, rejection and false-command goals after pilot review</w:t>
             </w:r>
           </w:p>
         </w:tc>
@@ -2994,7 +2943,7 @@
                 <w:b w:val="0"/>
                 <w:sz w:val="20"/>
               </w:rPr>
-              <w:t>At least 40 gestures with glasses on plus timing and reflection cancellation tests.</w:t>
+              <w:t>Held-out continuous S/SS/SSS/L/SL streams and negative reading; no prefix or duplicate dispatch.</w:t>
             </w:r>
           </w:p>
         </w:tc>
@@ -3018,7 +2967,7 @@
                 <w:b w:val="0"/>
                 <w:sz w:val="20"/>
               </w:rPr>
-              <w:t>Accidental clicks</w:t>
+              <w:t>False commands</w:t>
             </w:r>
           </w:p>
         </w:tc>
@@ -3037,7 +2986,7 @@
                 <w:b w:val="0"/>
                 <w:sz w:val="20"/>
               </w:rPr>
-              <w:t>Zero observed in two 30 minute ordinary use sessions</w:t>
+              <w:t>Freeze a task-appropriate rate goal before final evaluation</w:t>
             </w:r>
           </w:p>
         </w:tc>
@@ -3056,7 +3005,7 @@
                 <w:b w:val="0"/>
                 <w:sz w:val="20"/>
               </w:rPr>
-              <w:t>Two sessions with glasses at 70 cm; annotate intended actions and ordinary lighting changes.</w:t>
+              <w:t>Initial 9 test minutes are screening only; extend ordinary-use negative evaluation for rare-error claims.</w:t>
             </w:r>
           </w:p>
         </w:tc>
@@ -3180,7 +3129,7 @@
                 <w:b w:val="0"/>
                 <w:sz w:val="20"/>
               </w:rPr>
-              <w:t>Mock backend tests and native disconnect, stale frame, and pause trials.</w:t>
+              <w:t>Mock and native left/right/middle down/up, pause, permission and failure tests; report unavailable release delivery.</w:t>
             </w:r>
           </w:p>
         </w:tc>
@@ -3268,21 +3217,19 @@
       </w:hyperlink>
     </w:p>
     <w:p>
-      <w:r>
-        <w:br w:type="page"/>
-      </w:r>
-    </w:p>
-    <w:p>
       <w:pPr>
         <w:pStyle w:val="Heading1"/>
       </w:pPr>
       <w:r>
+        <w:rPr>
+          <w:color w:val="000000"/>
+        </w:rPr>
         <w:t>Implementation timeline</w:t>
       </w:r>
     </w:p>
     <w:p>
       <w:r>
-        <w:t>Plan 20 working days for one developer, at six focused hours per day, or approximately 120 engineering hours. Access to the Ubuntu laptop is required from day 1. Glasses and 70 cm lighting trials are included in the core schedule. The user contributes calibration trials and two 30 minute use sessions. Dates remain relative to the eventual start date.</w:t>
+        <w:t>Implementation now proceeds by evidence stages rather than the original four-week commitment. The three pilots determine acquisition usability, gesture observability and the revised schedule. Initial combined gaze and gesture work is about 10 to 15 minutes per session, spread across days; this estimate must be checked during the pilot.</w:t>
       </w:r>
     </w:p>
     <w:p>
@@ -3290,7 +3237,7 @@
         <w:keepNext/>
       </w:pPr>
       <w:r>
-        <w:t>The four week target covers one tested Ubuntu desktop backend. Reserve 3 to 7 extra engineering days if Wayland needs additional helper or coordinate work; commit to the delivery date after the day 1 probe. Alternative estimators and selection assistance remain separate extensions. No hardware purchase or NPU work is required before the initial measurements.</w:t>
+        <w:t>The original 120-hour development estimate did not include the expanded held-button and multi-sequence evaluation scope. Re-estimate remaining work after pilots rather than carrying that deadline forward. Keep collection, fitting, independent evaluation, mock control, live application testing and packaging sequential.</w:t>
       </w:r>
     </w:p>
     <w:tbl>
@@ -3340,7 +3287,7 @@
                 <w:b/>
                 <w:sz w:val="20"/>
               </w:rPr>
-              <w:t>Window</w:t>
+              <w:t>Stage</w:t>
             </w:r>
           </w:p>
         </w:tc>
@@ -3404,11 +3351,7 @@
                 <w:b w:val="0"/>
                 <w:sz w:val="20"/>
               </w:rPr>
-              <w:t>Week 1</w:t>
-              <w:br/>
-              <w:t>Day 1</w:t>
-              <w:br/>
-              <w:t>6 hours</w:t>
+              <w:t>Completed environment stage</w:t>
             </w:r>
           </w:p>
         </w:tc>
@@ -3427,7 +3370,7 @@
                 <w:b w:val="0"/>
                 <w:sz w:val="20"/>
               </w:rPr>
-              <w:t>Confirm Ubuntu session, scaling, kernel, RGB camera identity and modes. Test Python 3.12 and portal input plus pause. A C L</w:t>
+              <w:t>Capture and diagnostic EIS mapping/pause reviewed with scoped limits.</w:t>
             </w:r>
           </w:p>
         </w:tc>
@@ -3446,7 +3389,7 @@
                 <w:b w:val="0"/>
                 <w:sz w:val="20"/>
               </w:rPr>
-              <w:t>Environment record, locked baseline, and tested backend choice. Gate T0.</w:t>
+              <w:t>Proceed to collection design; about 15 FPS is provisional.</w:t>
             </w:r>
           </w:p>
         </w:tc>
@@ -3470,11 +3413,7 @@
                 <w:b w:val="0"/>
                 <w:sz w:val="20"/>
               </w:rPr>
-              <w:t>Week 1</w:t>
-              <w:br/>
-              <w:t>Days 2 to 4</w:t>
-              <w:br/>
-              <w:t>18 hours</w:t>
+              <w:t>Collector implementation</w:t>
             </w:r>
           </w:p>
         </w:tc>
@@ -3493,7 +3432,7 @@
                 <w:b w:val="0"/>
                 <w:sz w:val="20"/>
               </w:rPr>
-              <w:t>Compare 720p and 1080p with glasses at 70 cm. Adjust lighting, inspect landmarks, and test EyeTrax locally. C V Q</w:t>
+              <w:t>Four-corner flow, numeric records, gesture/negative roles and labels.</w:t>
             </w:r>
           </w:p>
         </w:tc>
@@ -3512,7 +3451,7 @@
                 <w:b w:val="0"/>
                 <w:sz w:val="20"/>
               </w:rPr>
-              <w:t>Camera and glare report, chosen mode, and repeatable eye movement features. Needs T0.</w:t>
+              <w:t>No desktop input; synthetic timing and state checks.</w:t>
             </w:r>
           </w:p>
         </w:tc>
@@ -3536,11 +3475,7 @@
                 <w:b w:val="0"/>
                 <w:sz w:val="20"/>
               </w:rPr>
-              <w:t>Weeks 1 and 2</w:t>
-              <w:br/>
-              <w:t>Days 5 to 7</w:t>
-              <w:br/>
-              <w:t>18 hours</w:t>
+              <w:t>Three Linux pilots</w:t>
             </w:r>
           </w:p>
         </w:tc>
@@ -3559,7 +3494,7 @@
                 <w:b w:val="0"/>
                 <w:sz w:val="20"/>
               </w:rPr>
-              <w:t>Calibrate at 70 cm with glasses, fit regression, and validate fresh central and edge targets. K E P</w:t>
+              <w:t>One per lighting category; inspect eye traces, comfort, throughput and labels.</w:t>
             </w:r>
           </w:p>
         </w:tc>
@@ -3578,7 +3513,7 @@
                 <w:b w:val="0"/>
                 <w:sz w:val="20"/>
               </w:rPr>
-              <w:t>Accuracy report, distance tolerance check, and target size recommendation. Gate T1.</w:t>
+              <w:t>Freeze acquisition rules, supported vocabulary and session splits.</w:t>
             </w:r>
           </w:p>
         </w:tc>
@@ -3602,11 +3537,7 @@
                 <w:b w:val="0"/>
                 <w:sz w:val="20"/>
               </w:rPr>
-              <w:t>Week 2</w:t>
-              <w:br/>
-              <w:t>Days 8 to 10</w:t>
-              <w:br/>
-              <w:t>18 hours</w:t>
+              <w:t>Initial dataset</w:t>
             </w:r>
           </w:p>
         </w:tc>
@@ -3625,7 +3556,7 @@
                 <w:b w:val="0"/>
                 <w:sz w:val="20"/>
               </w:rPr>
-              <w:t>Tune filtering and pre blink target latching. Personalize closure timing and test glare cancellation with a mock backend. F G L</w:t>
+              <w:t>15 sessions; gaze plus 375 gesture sequences and 45 minutes negative reading.</w:t>
             </w:r>
           </w:p>
         </w:tc>
@@ -3644,7 +3575,7 @@
                 <w:b w:val="0"/>
                 <w:sz w:val="20"/>
               </w:rPr>
-              <w:t>Stable dry run pointer and tested blink or dwell mode. Gate T2.</w:t>
+              <w:t>Counts are initial budgets; retain confirmed and uncertain labels.</w:t>
             </w:r>
           </w:p>
         </w:tc>
@@ -3668,11 +3599,7 @@
                 <w:b w:val="0"/>
                 <w:sz w:val="20"/>
               </w:rPr>
-              <w:t>Week 3</w:t>
-              <w:br/>
-              <w:t>Days 11 to 13</w:t>
-              <w:br/>
-              <w:t>18 hours</w:t>
+              <w:t>Personal fitting</w:t>
             </w:r>
           </w:p>
         </w:tc>
@@ -3691,7 +3618,7 @@
                 <w:b w:val="0"/>
                 <w:sz w:val="20"/>
               </w:rPr>
-              <w:t>Implement chosen native backend, coordinates, pause shortcut, watchdog, and lifecycle. L</w:t>
+              <w:t>Gaze regression and gesture reference/timing fitting; optional classifier comparison.</w:t>
             </w:r>
           </w:p>
         </w:tc>
@@ -3710,7 +3637,7 @@
                 <w:b w:val="0"/>
                 <w:sz w:val="20"/>
               </w:rPr>
-              <w:t>Controlled desktop pilot with reliable pause and release. Gate T3.</w:t>
+              <w:t>Training/development only; freeze chosen versions.</w:t>
             </w:r>
           </w:p>
         </w:tc>
@@ -3734,11 +3661,7 @@
                 <w:b w:val="0"/>
                 <w:sz w:val="20"/>
               </w:rPr>
-              <w:t>Week 3</w:t>
-              <w:br/>
-              <w:t>Days 14 and 15</w:t>
-              <w:br/>
-              <w:t>12 hours</w:t>
+              <w:t>Independent evaluation</w:t>
             </w:r>
           </w:p>
         </w:tc>
@@ -3757,7 +3680,7 @@
                 <w:b w:val="0"/>
                 <w:sz w:val="20"/>
               </w:rPr>
-              <w:t>Setup and settings UI, profile checks, drift check, privacy controls. U K P</w:t>
+              <w:t>New session/day targets and continuous gesture streams; mock button states.</w:t>
             </w:r>
           </w:p>
         </w:tc>
@@ -3776,7 +3699,7 @@
                 <w:b w:val="0"/>
                 <w:sz w:val="20"/>
               </w:rPr>
-              <w:t>Complete user workflow from setup to recovery.</w:t>
+              <w:t>Report error, confusion, false commands, rejection and latency.</w:t>
             </w:r>
           </w:p>
         </w:tc>
@@ -3800,11 +3723,7 @@
                 <w:b w:val="0"/>
                 <w:sz w:val="20"/>
               </w:rPr>
-              <w:t>Week 4</w:t>
-              <w:br/>
-              <w:t>Days 16 to 18</w:t>
-              <w:br/>
-              <w:t>18 hours</w:t>
+              <w:t>Live integration</w:t>
             </w:r>
           </w:p>
         </w:tc>
@@ -3823,7 +3742,7 @@
                 <w:b w:val="0"/>
                 <w:sz w:val="20"/>
               </w:rPr>
-              <w:t>Run target selection, lighting and repositioning tests, two ordinary use sessions, and focused fixes. Q</w:t>
+              <w:t>Left/right/middle down/up, dragging, pause and application behavior.</w:t>
             </w:r>
           </w:p>
         </w:tc>
@@ -3842,7 +3761,7 @@
                 <w:b w:val="0"/>
                 <w:sz w:val="20"/>
               </w:rPr>
-              <w:t>Acceptance report for the stated glasses, distance, and lighting. Gate T4.</w:t>
+              <w:t>Verify release/loss handling and longer ordinary-use trials.</w:t>
             </w:r>
           </w:p>
         </w:tc>
@@ -3866,11 +3785,7 @@
                 <w:b w:val="0"/>
                 <w:sz w:val="20"/>
               </w:rPr>
-              <w:t>Week 4</w:t>
-              <w:br/>
-              <w:t>Days 19 and 20</w:t>
-              <w:br/>
-              <w:t>12 hours</w:t>
+              <w:t>Offline delivery</w:t>
             </w:r>
           </w:p>
         </w:tc>
@@ -3889,7 +3804,7 @@
                 <w:b w:val="0"/>
                 <w:sz w:val="20"/>
               </w:rPr>
-              <w:t>Package Ubuntu 24.04 dependencies and models offline; verify clean install, instructions, and notices. A P Q</w:t>
+              <w:t>Lock compatible dependencies, local assets, notices and instructions.</w:t>
             </w:r>
           </w:p>
         </w:tc>
@@ -3908,7 +3823,7 @@
                 <w:b w:val="0"/>
                 <w:sz w:val="20"/>
               </w:rPr>
-              <w:t>Installable personal release on the tested laptop and desktop session. Gate T5.</w:t>
+              <w:t>Reproducible installation on the tested laptop.</w:t>
             </w:r>
           </w:p>
         </w:tc>
@@ -3921,7 +3836,7 @@
     </w:p>
     <w:p>
       <w:r>
-        <w:t>Critical path. Native backend feasibility leads into camera and feature quality, then calibration validation, gesture testing, real input integration, user evaluation, and offline release. The schedule is sequential for one developer; its hour estimates do not assume parallel staff.</w:t>
+        <w:t>Critical path. Implement collection and four-corner calibration, review three pilots, freeze acquisition and splits, collect both datasets, fit gaze and gesture components independently, test mock controller states, then validate live buttons and applications. A classifier is optional; reliable labels and negative data are required even for rules.</w:t>
       </w:r>
     </w:p>
     <w:p>
@@ -3930,6 +3845,9 @@
         <w:keepNext/>
       </w:pPr>
       <w:r>
+        <w:rPr>
+          <w:color w:val="000000"/>
+        </w:rPr>
         <w:t>Milestone decisions</w:t>
       </w:r>
     </w:p>
@@ -4045,8 +3963,6 @@
                 <w:sz w:val="20"/>
               </w:rPr>
               <w:t>T0</w:t>
-              <w:br/>
-              <w:t>Day 1</w:t>
             </w:r>
           </w:p>
         </w:tc>
@@ -4065,7 +3981,7 @@
                 <w:b w:val="0"/>
                 <w:sz w:val="20"/>
               </w:rPr>
-              <w:t>Python packages import; RGB camera modes are listed; native absolute input and desktop pause work in a minimal probe.</w:t>
+              <w:t>Reviewed environment evidence with stated limits</w:t>
             </w:r>
           </w:p>
         </w:tc>
@@ -4084,7 +4000,7 @@
                 <w:b w:val="0"/>
                 <w:sz w:val="20"/>
               </w:rPr>
-              <w:t>Resolve compatibility first. Allocate the Wayland contingency if needed; later control work stays in dry run.</w:t>
+              <w:t>Resolve only new blocking capture/runtime issues.</w:t>
             </w:r>
           </w:p>
         </w:tc>
@@ -4109,8 +4025,6 @@
                 <w:sz w:val="20"/>
               </w:rPr>
               <w:t>T1</w:t>
-              <w:br/>
-              <w:t>Day 7</w:t>
             </w:r>
           </w:p>
         </w:tc>
@@ -4129,7 +4043,7 @@
                 <w:b w:val="0"/>
                 <w:sz w:val="20"/>
               </w:rPr>
-              <w:t>With glasses at 70 cm, fresh validation and preliminary trials establish a useful target size in the selected lighting.</w:t>
+              <w:t>Pilot and dataset quality support calibration and independent fitting</w:t>
             </w:r>
           </w:p>
         </w:tc>
@@ -4148,7 +4062,7 @@
                 <w:b w:val="0"/>
                 <w:sz w:val="20"/>
               </w:rPr>
-              <w:t>Adjust glare, capture mode, and calibration first. Add an estimator or assistance branch only if needed.</w:t>
+              <w:t>Improve acquisition/labels before collecting more.</w:t>
             </w:r>
           </w:p>
         </w:tc>
@@ -4173,8 +4087,6 @@
                 <w:sz w:val="20"/>
               </w:rPr>
               <w:t>T2</w:t>
-              <w:br/>
-              <w:t>Day 10</w:t>
             </w:r>
           </w:p>
         </w:tc>
@@ -4193,7 +4105,7 @@
                 <w:b w:val="0"/>
                 <w:sz w:val="20"/>
               </w:rPr>
-              <w:t>Gesture and controller tests pass, including all cancellation paths.</w:t>
+              <w:t>Gesture stream and mock controller state tests pass</w:t>
             </w:r>
           </w:p>
         </w:tc>
@@ -4212,7 +4124,7 @@
                 <w:b w:val="0"/>
                 <w:sz w:val="20"/>
               </w:rPr>
-              <w:t>Keep native clicking disabled and repair state handling.</w:t>
+              <w:t>Keep real buttons disabled; fix recognition or state logic.</w:t>
             </w:r>
           </w:p>
         </w:tc>
@@ -4237,8 +4149,6 @@
                 <w:sz w:val="20"/>
               </w:rPr>
               <w:t>T3</w:t>
-              <w:br/>
-              <w:t>Day 13</w:t>
             </w:r>
           </w:p>
         </w:tc>
@@ -4257,7 +4167,7 @@
                 <w:b w:val="0"/>
                 <w:sz w:val="20"/>
               </w:rPr>
-              <w:t>Native coordinate, permission, pause, and release tests pass.</w:t>
+              <w:t>Native down/up, pause and release tested for all three buttons</w:t>
             </w:r>
           </w:p>
         </w:tc>
@@ -4276,7 +4186,7 @@
                 <w:b w:val="0"/>
                 <w:sz w:val="20"/>
               </w:rPr>
-              <w:t>Repair the selected backend or revise the supported desktop and schedule.</w:t>
+              <w:t>Repair backend/lifecycle behavior before ordinary use.</w:t>
             </w:r>
           </w:p>
         </w:tc>
@@ -4301,8 +4211,6 @@
                 <w:sz w:val="20"/>
               </w:rPr>
               <w:t>T4</w:t>
-              <w:br/>
-              <w:t>Day 18</w:t>
             </w:r>
           </w:p>
         </w:tc>
@@ -4321,7 +4229,7 @@
                 <w:b w:val="0"/>
                 <w:sz w:val="20"/>
               </w:rPr>
-              <w:t>Acceptance report covers target size, unintended clicks, drift, and latency.</w:t>
+              <w:t>Independent accuracy and extended false-command evaluation</w:t>
             </w:r>
           </w:p>
         </w:tc>
@@ -4340,7 +4248,7 @@
                 <w:b w:val="0"/>
                 <w:sz w:val="20"/>
               </w:rPr>
-              <w:t>Tune and retest changed behavior; report remaining limits explicitly.</w:t>
+              <w:t>Revise supported conditions or interaction design using new development data.</w:t>
             </w:r>
           </w:p>
         </w:tc>
@@ -4365,8 +4273,6 @@
                 <w:sz w:val="20"/>
               </w:rPr>
               <w:t>T5</w:t>
-              <w:br/>
-              <w:t>Day 20</w:t>
             </w:r>
           </w:p>
         </w:tc>
@@ -4385,7 +4291,7 @@
                 <w:b w:val="0"/>
                 <w:sz w:val="20"/>
               </w:rPr>
-              <w:t>Clean installation and offline runtime pass; instructions reproduce setup.</w:t>
+              <w:t>Clean offline install and complete user instructions</w:t>
             </w:r>
           </w:p>
         </w:tc>
@@ -4404,7 +4310,7 @@
                 <w:b w:val="0"/>
                 <w:sz w:val="20"/>
               </w:rPr>
-              <w:t>Fix packaging and missing assets before handover.</w:t>
+              <w:t>Repair packaging before handover.</w:t>
             </w:r>
           </w:p>
         </w:tc>
@@ -4421,6 +4327,9 @@
         <w:keepNext/>
       </w:pPr>
       <w:r>
+        <w:rPr>
+          <w:color w:val="000000"/>
+        </w:rPr>
         <w:t>Conditional work and added time</w:t>
       </w:r>
     </w:p>
@@ -4721,7 +4630,7 @@
                 <w:b w:val="0"/>
                 <w:sz w:val="20"/>
               </w:rPr>
-              <w:t>User wants scrolling, dragging, and right click</w:t>
+              <w:t>Gesture rules remain inadequate after calibrated trials</w:t>
             </w:r>
           </w:p>
         </w:tc>
@@ -4740,7 +4649,7 @@
                 <w:b w:val="0"/>
                 <w:sz w:val="20"/>
               </w:rPr>
-              <w:t>3 to 5 days after the core release</w:t>
+              <w:t>Re-estimate after failure analysis and data review</w:t>
             </w:r>
           </w:p>
         </w:tc>
@@ -4759,7 +4668,7 @@
                 <w:b w:val="0"/>
                 <w:sz w:val="20"/>
               </w:rPr>
-              <w:t>Separate mode and cancellation tests pass for each operation.</w:t>
+              <w:t>A small classifier improves held-out recognition without hiding false commands or rejections.</w:t>
             </w:r>
           </w:p>
         </w:tc>
@@ -4772,7 +4681,7 @@
     </w:p>
     <w:p>
       <w:r>
-        <w:t>These allowances are additive if multiple branches are needed. Preserve the core diagnostic and evaluation work even if hardware proves inadequate. Change the estimator or interaction design before committing to a hardware purchase; no accuracy improvement is promised without measurement.</w:t>
+        <w:t>Use conditional work only when evidence identifies a need. A learned gesture classifier should be compared with personalized rules on the same independent sessions. Do not train on rule-generated labels and call agreement ground truth. Keep raw image recording a separate decision and preserve all historical validation reports.</w:t>
       </w:r>
     </w:p>
     <w:p>
@@ -4781,7 +4690,10 @@
         <w:keepNext/>
       </w:pPr>
       <w:r>
-        <w:t>Remaining decisions before coding</w:t>
+        <w:rPr>
+          <w:color w:val="000000"/>
+        </w:rPr>
+        <w:t>Remaining implementation decisions</w:t>
       </w:r>
     </w:p>
     <w:tbl>
@@ -4914,7 +4826,7 @@
                 <w:b w:val="0"/>
                 <w:sz w:val="20"/>
               </w:rPr>
-              <w:t>Ubuntu 24.04 x86_64; GNOME Wayland candidate, confirmed by local inspection</w:t>
+              <w:t>Observed Ubuntu GNOME Wayland setup; preserve recorded versions and EIS mapping.</w:t>
             </w:r>
           </w:p>
         </w:tc>
@@ -4933,7 +4845,7 @@
                 <w:b w:val="0"/>
                 <w:sz w:val="20"/>
               </w:rPr>
-              <w:t>Day 1 environment inventory</w:t>
+              <w:t>Already reviewed; recheck only on changes.</w:t>
             </w:r>
           </w:p>
         </w:tc>
@@ -4976,7 +4888,7 @@
                 <w:b w:val="0"/>
                 <w:sz w:val="20"/>
               </w:rPr>
-              <w:t>Compare 720p and 1080p with glasses at 70 cm; choose by measured quality</w:t>
+              <w:t>1080p MJPG collection pilot; 720p sustained baseline remains historical evidence.</w:t>
             </w:r>
           </w:p>
         </w:tc>
@@ -4995,7 +4907,7 @@
                 <w:b w:val="0"/>
                 <w:sz w:val="20"/>
               </w:rPr>
-              <w:t>Days 2 to 4 diagnostics</w:t>
+              <w:t>Three acquisition pilots.</w:t>
             </w:r>
           </w:p>
         </w:tc>
@@ -5057,7 +4969,7 @@
                 <w:b w:val="0"/>
                 <w:sz w:val="20"/>
               </w:rPr>
-              <w:t>Agree before final evaluation; initial result on day 7</w:t>
+              <w:t>Before independent application evaluation.</w:t>
             </w:r>
           </w:p>
         </w:tc>
@@ -5081,7 +4993,7 @@
                 <w:b w:val="0"/>
                 <w:sz w:val="20"/>
               </w:rPr>
-              <w:t>Preferred blink duration or dwell alternative</w:t>
+              <w:t>Gesture thresholds and action bindings</w:t>
             </w:r>
           </w:p>
         </w:tc>
@@ -5100,7 +5012,7 @@
                 <w:b w:val="0"/>
                 <w:sz w:val="20"/>
               </w:rPr>
-              <w:t>Personalize 500 to 900 ms blink interval</w:t>
+              <w:t>SSS reserved for middle; fit personal timing, defer other bindings.</w:t>
             </w:r>
           </w:p>
         </w:tc>
@@ -5119,7 +5031,7 @@
                 <w:b w:val="0"/>
                 <w:sz w:val="20"/>
               </w:rPr>
-              <w:t>Days 8 to 10 gesture trials</w:t>
+              <w:t>Training/development trials before final evaluation.</w:t>
             </w:r>
           </w:p>
         </w:tc>
@@ -5243,7 +5155,7 @@
                 <w:b w:val="0"/>
                 <w:sz w:val="20"/>
               </w:rPr>
-              <w:t>Day 7 evidence, revisited during user trials</w:t>
+              <w:t>Independent gaze evidence before live task evaluation.</w:t>
             </w:r>
           </w:p>
         </w:tc>
@@ -5255,21 +5167,32 @@
       </w:pPr>
     </w:p>
     <w:p>
+      <w:r>
+        <w:t>Detailed acquisition and recognition specifications are maintained in docs/DATA_COLLECTION_PLAN.md, docs/GESTURE_COLLECTION_TRAINING.md, docs/MODEL_ARCHITECTURE.md and docs/ACTION_GESTURE_DESIGN.md. Those files define numeric record roles, grouped splits, label confirmation, optional classifiers and pending bindings. Historical validation reports remain unchanged.</w:t>
+      </w:r>
+    </w:p>
+    <w:p>
       <w:pPr>
         <w:pStyle w:val="Heading1"/>
       </w:pPr>
       <w:r>
+        <w:rPr>
+          <w:color w:val="000000"/>
+        </w:rPr>
         <w:t>Technical source references</w:t>
       </w:r>
     </w:p>
     <w:p>
+      <w:pPr>
+        <w:spacing w:after="0"/>
+      </w:pPr>
       <w:r>
         <w:t>Primary documentation and project sources consulted on 19 October 2026. References support platform specifications and software capabilities. The camera entry is a platform reference pending verification on the user's unit. Model settings, thresholds, acceptance targets, and schedule estimates are engineering proposals.</w:t>
       </w:r>
     </w:p>
     <w:p>
       <w:pPr>
-        <w:spacing w:after="60" w:line="240" w:lineRule="auto"/>
+        <w:spacing w:after="0" w:line="240" w:lineRule="auto"/>
       </w:pPr>
       <w:r>
         <w:rPr>
@@ -5291,7 +5214,7 @@
     </w:p>
     <w:p>
       <w:pPr>
-        <w:spacing w:after="60" w:line="240" w:lineRule="auto"/>
+        <w:spacing w:after="0" w:line="240" w:lineRule="auto"/>
       </w:pPr>
       <w:r>
         <w:rPr>
@@ -5313,7 +5236,7 @@
     </w:p>
     <w:p>
       <w:pPr>
-        <w:spacing w:after="60" w:line="240" w:lineRule="auto"/>
+        <w:spacing w:after="0" w:line="240" w:lineRule="auto"/>
       </w:pPr>
       <w:r>
         <w:rPr>
@@ -5335,7 +5258,7 @@
     </w:p>
     <w:p>
       <w:pPr>
-        <w:spacing w:after="60" w:line="240" w:lineRule="auto"/>
+        <w:spacing w:after="0" w:line="240" w:lineRule="auto"/>
       </w:pPr>
       <w:r>
         <w:rPr>
@@ -5357,7 +5280,7 @@
     </w:p>
     <w:p>
       <w:pPr>
-        <w:spacing w:after="60" w:line="240" w:lineRule="auto"/>
+        <w:spacing w:after="0" w:line="240" w:lineRule="auto"/>
       </w:pPr>
       <w:r>
         <w:rPr>
@@ -5379,7 +5302,7 @@
     </w:p>
     <w:p>
       <w:pPr>
-        <w:spacing w:after="60" w:line="240" w:lineRule="auto"/>
+        <w:spacing w:after="0" w:line="240" w:lineRule="auto"/>
       </w:pPr>
       <w:r>
         <w:rPr>
@@ -5401,7 +5324,7 @@
     </w:p>
     <w:p>
       <w:pPr>
-        <w:spacing w:after="60" w:line="240" w:lineRule="auto"/>
+        <w:spacing w:after="0" w:line="240" w:lineRule="auto"/>
       </w:pPr>
       <w:r>
         <w:rPr>
@@ -5423,7 +5346,7 @@
     </w:p>
     <w:p>
       <w:pPr>
-        <w:spacing w:after="60" w:line="240" w:lineRule="auto"/>
+        <w:spacing w:after="0" w:line="240" w:lineRule="auto"/>
       </w:pPr>
       <w:r>
         <w:rPr>
@@ -5445,7 +5368,7 @@
     </w:p>
     <w:p>
       <w:pPr>
-        <w:spacing w:after="60" w:line="240" w:lineRule="auto"/>
+        <w:spacing w:after="0" w:line="240" w:lineRule="auto"/>
       </w:pPr>
       <w:r>
         <w:rPr>
@@ -5467,7 +5390,7 @@
     </w:p>
     <w:p>
       <w:pPr>
-        <w:spacing w:after="60" w:line="240" w:lineRule="auto"/>
+        <w:spacing w:after="0" w:line="240" w:lineRule="auto"/>
       </w:pPr>
       <w:r>
         <w:rPr>
@@ -5489,7 +5412,7 @@
     </w:p>
     <w:p>
       <w:pPr>
-        <w:spacing w:after="60" w:line="240" w:lineRule="auto"/>
+        <w:spacing w:after="0" w:line="240" w:lineRule="auto"/>
       </w:pPr>
       <w:r>
         <w:rPr>
@@ -5511,7 +5434,7 @@
     </w:p>
     <w:p>
       <w:pPr>
-        <w:spacing w:after="60" w:line="240" w:lineRule="auto"/>
+        <w:spacing w:after="0" w:line="240" w:lineRule="auto"/>
       </w:pPr>
       <w:r>
         <w:rPr>
@@ -5533,7 +5456,7 @@
     </w:p>
     <w:p>
       <w:pPr>
-        <w:spacing w:after="60" w:line="240" w:lineRule="auto"/>
+        <w:spacing w:after="0" w:line="240" w:lineRule="auto"/>
       </w:pPr>
       <w:r>
         <w:rPr>
@@ -5555,7 +5478,7 @@
     </w:p>
     <w:p>
       <w:pPr>
-        <w:spacing w:after="60" w:line="240" w:lineRule="auto"/>
+        <w:spacing w:after="0" w:line="240" w:lineRule="auto"/>
       </w:pPr>
       <w:r>
         <w:rPr>
@@ -5577,7 +5500,7 @@
     </w:p>
     <w:p>
       <w:pPr>
-        <w:spacing w:after="60" w:line="240" w:lineRule="auto"/>
+        <w:spacing w:after="0" w:line="240" w:lineRule="auto"/>
       </w:pPr>
       <w:r>
         <w:rPr>
@@ -5599,7 +5522,7 @@
     </w:p>
     <w:p>
       <w:pPr>
-        <w:spacing w:after="60" w:line="240" w:lineRule="auto"/>
+        <w:spacing w:after="0" w:line="240" w:lineRule="auto"/>
       </w:pPr>
       <w:r>
         <w:rPr>
@@ -5621,7 +5544,7 @@
     </w:p>
     <w:p>
       <w:pPr>
-        <w:spacing w:after="60" w:line="240" w:lineRule="auto"/>
+        <w:spacing w:after="0" w:line="240" w:lineRule="auto"/>
       </w:pPr>
       <w:hyperlink r:id="rId27">
         <w:r>
@@ -5636,7 +5559,7 @@
     </w:p>
     <w:p>
       <w:pPr>
-        <w:spacing w:after="60" w:line="240" w:lineRule="auto"/>
+        <w:spacing w:after="0" w:line="240" w:lineRule="auto"/>
       </w:pPr>
       <w:hyperlink r:id="rId26">
         <w:r>
@@ -5651,7 +5574,7 @@
     </w:p>
     <w:p>
       <w:pPr>
-        <w:spacing w:after="60" w:line="240" w:lineRule="auto"/>
+        <w:spacing w:after="0" w:line="240" w:lineRule="auto"/>
       </w:pPr>
       <w:hyperlink r:id="rId30">
         <w:r>
@@ -5666,7 +5589,7 @@
     </w:p>
     <w:p>
       <w:pPr>
-        <w:spacing w:after="60" w:line="240" w:lineRule="auto"/>
+        <w:spacing w:after="0" w:line="240" w:lineRule="auto"/>
       </w:pPr>
       <w:hyperlink r:id="rId28">
         <w:r>
@@ -5681,7 +5604,7 @@
     </w:p>
     <w:p>
       <w:pPr>
-        <w:spacing w:after="60" w:line="240" w:lineRule="auto"/>
+        <w:spacing w:after="0" w:line="240" w:lineRule="auto"/>
       </w:pPr>
       <w:hyperlink r:id="rId29">
         <w:r>

</xml_diff>